<commit_message>
rerun with small spelling mistiakes fixed
</commit_message>
<xml_diff>
--- a/docs/index.docx
+++ b/docs/index.docx
@@ -652,7 +652,7 @@
         <w:pStyle w:val="FirstParagraph"/>
       </w:pPr>
       <w:r>
-        <w:t xml:space="preserve">Study sites were selected in five lakes located in the Rotorua Te Arawa Lakes area in the North Island of Aotearoa. The Lakes Rotorua, Rotoiti, Rotoehu, Rotomā, and Ōkāreka are located on a warm- temperate volcanic plateau (280-355 m) where winters are mild and year-round temperatures typically varies from 4°C to 24°C. The lakes span a wide range of morphometric and trophic conditions from shallow polymictic eutrophic systems (Rotoehu, maximum depth 14 m) to deep stratified oligotrophic lakes (Rotomā, maximum depth 83 m). Shorelines are characterised by a mix of native riparian vegetation, exotic pasture, and low-density residential development, with several lakes also supporting stands of emergent macrophytes. Detailed lake characteristics and shoreline composition are summarised in</w:t>
+        <w:t xml:space="preserve">Study sites were selected in five lakes located in the Rotorua Te Arawa Lakes area in the North Island of Aotearoa. The Lakes Rotorua, Rotoiti, Rotoehu, Rotomā, and Ōkāreka are located on a warm-temperate volcanic plateau (280-355 m) where winters are mild and year-round temperatures typically vary from 4°C to 24°C. The lakes span a wide range of morphometric and trophic conditions from shallow polymictic eutrophic systems (Rotoehu, maximum depth 14 m) to deep stratified oligotrophic lakes (Rotomā, maximum depth 83 m). Shorelines are characterised by a mix of native riparian vegetation, exotic pasture, and low-density residential development, with several lakes also supporting stands of emergent macrophytes. Detailed lake characteristics and shoreline composition are summarised in</w:t>
       </w:r>
       <w:r>
         <w:t xml:space="preserve"> </w:t>
@@ -4714,7 +4714,7 @@
         <w:t xml:space="preserve">(Quinn &amp; Hickey, 1990)</w:t>
       </w:r>
       <w:r>
-        <w:t xml:space="preserve">, where larger pore spaces between coarse particles may favour adult kōura, smaller interstitial spaces within mixed substrates may provide refugia for juveniles, suggesting that heterogenous substrates support kōura across life stages. However, mixed substrates containing both coarse and fine particles can reduce pore space availability as smaller particles infill void spaces between larger ones</w:t>
+        <w:t xml:space="preserve">, where larger pore spaces between coarse particles may favour adult kōura, while smaller interstitial spaces within mixed substrates may provide refugia for juveniles, suggesting that heterogeneous substrates support kōura across life stages. However, mixed substrates containing both coarse and fine particles can reduce pore space availability as smaller particles infill void spaces between larger ones</w:t>
       </w:r>
       <w:r>
         <w:t xml:space="preserve"> </w:t>
@@ -5028,7 +5028,7 @@
         <w:t xml:space="preserve">(Capinha et al., 2013; Lee et al., 2025)</w:t>
       </w:r>
       <w:r>
-        <w:t xml:space="preserve">. While such broad-scale drivers are difficult to manage directly, local habitat conditions represent a tractable management lever. The strong association between kōura occurrence and coarse substrate availability suggests that an absence of interstitial refuge availability may act as a limiting factor freshwater crayfish populations in these systems. Accordingly, management actions that prioritise the protection and enhancement of coarse littoral substrates and riparian vegetation, including the targeted placement of rocks in areas already used by freshwater crayfish</w:t>
+        <w:t xml:space="preserve">. While such broad-scale drivers are difficult to manage directly, local habitat conditions represent a tractable management lever. The strong association between kōura occurrence and coarse substrate availability suggests that an absence of interstitial refuge availability may act as a limiting factor for freshwater crayfish populations in these systems. Accordingly, management actions that prioritise the protection and enhancement of coarse littoral substrates and riparian vegetation, including the targeted placement of rocks in areas already used by freshwater crayfish</w:t>
       </w:r>
       <w:r>
         <w:t xml:space="preserve"> </w:t>
@@ -6507,7 +6507,7 @@
         <w:pStyle w:val="Bibliography"/>
       </w:pPr>
       <w:r>
-        <w:t xml:space="preserve">Kusabs, I. A., B. J. Hicks, J. M. Quinn, &amp; D. P. Hamilton, 2015a. Sustainable management of freshwater crayfish (k</w:t>
+        <w:t xml:space="preserve">Kusabs, I. A. K., B. J. Hicks, J. M. Quinn, &amp; D. P. Hamilton, 2015a. Sustainable management of freshwater crayfish (k</w:t>
       </w:r>
       <w:r>
         <w:t xml:space="preserve">ō</w:t>
@@ -6577,7 +6577,7 @@
         <w:pStyle w:val="Bibliography"/>
       </w:pPr>
       <w:r>
-        <w:t xml:space="preserve">Kusabs, I. A., &amp; J. M. Quinn, 2009. Use of a traditional</w:t>
+        <w:t xml:space="preserve">Kusabs, I. A. K., &amp; J. M. Quinn, 2009. Use of a traditional</w:t>
       </w:r>
       <w:r>
         <w:t xml:space="preserve"> </w:t>
@@ -6656,7 +6656,7 @@
         <w:pStyle w:val="Bibliography"/>
       </w:pPr>
       <w:r>
-        <w:t xml:space="preserve">Kusabs, I. A., J. M. Quinn, &amp; D. P. Hamilton, 2015b. Effects of benthic substrate, nutrient enrichment and predatory fish on freshwater crayfish (k</w:t>
+        <w:t xml:space="preserve">Kusabs, I. A. K., J. M. Quinn, &amp; D. P. Hamilton, 2015b. Effects of benthic substrate, nutrient enrichment and predatory fish on freshwater crayfish (k</w:t>
       </w:r>
       <w:r>
         <w:t xml:space="preserve">ō</w:t>

</xml_diff>